<commit_message>
fixed report typos and exported as pdf
</commit_message>
<xml_diff>
--- a/docs/23012712 report.docx
+++ b/docs/23012712 report.docx
@@ -4400,14 +4400,7 @@
             <w:rStyle w:val="Hyperlink"/>
             <w:noProof/>
           </w:rPr>
-          <w:t>Table 3. Adaptive-system target-ran</w:t>
-        </w:r>
-        <w:r>
-          <w:rPr>
-            <w:rStyle w:val="Hyperlink"/>
-            <w:noProof/>
-          </w:rPr>
-          <w:t>g</w:t>
+          <w:t>Table 3. Adaptive-system target-rang</w:t>
         </w:r>
         <w:r>
           <w:rPr>
@@ -4421,21 +4414,7 @@
             <w:rStyle w:val="Hyperlink"/>
             <w:noProof/>
           </w:rPr>
-          <w:t xml:space="preserve"> and difficu</w:t>
-        </w:r>
-        <w:r>
-          <w:rPr>
-            <w:rStyle w:val="Hyperlink"/>
-            <w:noProof/>
-          </w:rPr>
-          <w:t>l</w:t>
-        </w:r>
-        <w:r>
-          <w:rPr>
-            <w:rStyle w:val="Hyperlink"/>
-            <w:noProof/>
-          </w:rPr>
-          <w:t>ty behaviour.</w:t>
+          <w:t xml:space="preserve"> and difficulty behaviour.</w:t>
         </w:r>
         <w:r>
           <w:rPr>
@@ -5475,29 +5454,8 @@
         <w:lastRenderedPageBreak/>
         <w:fldChar w:fldCharType="end"/>
       </w:r>
-    </w:p>
-    <w:p>
-      <w:pPr>
-        <w:spacing w:after="200" w:line="276" w:lineRule="auto"/>
-        <w:rPr>
-          <w:rFonts w:asciiTheme="majorHAnsi" w:eastAsiaTheme="majorEastAsia" w:hAnsiTheme="majorHAnsi" w:cstheme="majorBidi"/>
-          <w:color w:val="0F4761" w:themeColor="accent1" w:themeShade="BF"/>
-          <w:sz w:val="40"/>
-          <w:szCs w:val="40"/>
-        </w:rPr>
-      </w:pPr>
-      <w:r>
-        <w:br w:type="page"/>
-      </w:r>
-    </w:p>
-    <w:p>
-      <w:pPr>
-        <w:pStyle w:val="Heading1"/>
-        <w:jc w:val="both"/>
-      </w:pPr>
       <w:bookmarkStart w:id="3" w:name="_Toc239354288"/>
       <w:r>
-        <w:lastRenderedPageBreak/>
         <w:t>1. Introduction</w:t>
       </w:r>
       <w:bookmarkEnd w:id="3"/>
@@ -5526,7 +5484,15 @@
         <w:jc w:val="both"/>
       </w:pPr>
       <w:r>
-        <w:t>Traditional approaches usually rely on manually authored thresholds or fixed difficulty selections such as easy, normal and hard. These approaches are understandable and easy to control, but they cannot fully respond to changes that occur during play. Reinforcement learning (RL) offers a different formulation because the difficulty controller can observe a gameplay state, choose an adjustment, receive reward feedback and learn a policy over repeated interactions. This makes DDA a sequential decision-making problem rather than a one-off difficulty selection.</w:t>
+        <w:t xml:space="preserve">Traditional approaches usually rely on manually authored thresholds or fixed difficulty selections such as easy, normal and hard. These approaches are understandable and easy to control, but they cannot fully respond to changes that occur during play. Reinforcement learning (RL) offers a different formulation because the difficulty controller can observe a gameplay state, choose an adjustment, receive reward feedback and learn a policy </w:t>
+      </w:r>
+      <w:proofErr w:type="gramStart"/>
+      <w:r>
+        <w:t>over repeated interactions</w:t>
+      </w:r>
+      <w:proofErr w:type="gramEnd"/>
+      <w:r>
+        <w:t>. This makes DDA a sequential decision-making problem rather than a one-off difficulty selection.</w:t>
       </w:r>
     </w:p>
     <w:p>
@@ -5534,7 +5500,15 @@
         <w:jc w:val="both"/>
       </w:pPr>
       <w:r>
-        <w:t>This framing is central to the methodological anchor used in this dissertation. Climent et al. (2024) present a framework for designing RL agents specifically for DDA in single-player action games. Their framework explicitly defines states, actions and rewards, with states combining player and agent performance, actions increasing or decreasing game difficulty, and rewards reflecting gameplay outcomes such as round duration and winning/losing behaviour. The present project follows that structure, but adapts it to a Godot-based 2D survival prototype and uses PPO rather than the 2Q-table approach used by Climent et al. (2024).</w:t>
+        <w:t xml:space="preserve">This framing is central to the methodological anchor used in this dissertation. Climent et al. (2024) present a framework for designing RL agents specifically for DDA in single-player action games. Their framework explicitly defines states, actions and rewards, with states combining player and agent performance, actions increasing or decreasing game difficulty, and rewards reflecting gameplay outcomes such as round duration and winning/losing behaviour. The present project follows that </w:t>
+      </w:r>
+      <w:proofErr w:type="gramStart"/>
+      <w:r>
+        <w:t>structure, but</w:t>
+      </w:r>
+      <w:proofErr w:type="gramEnd"/>
+      <w:r>
+        <w:t xml:space="preserve"> adapts it to a Godot-based 2D survival prototype and uses PPO rather than the 2Q-table approach used by Climent et al. (2024).</w:t>
       </w:r>
     </w:p>
     <w:p>
@@ -5759,7 +5733,15 @@
         <w:jc w:val="both"/>
       </w:pPr>
       <w:r>
-        <w:t>Performance-based DDA extends this idea by using variables such as score, survival, deaths and accuracy. Affective systems attempt to estimate emotional state from physiological or behavioural signals, but this introduces sensor noise, additional implementation complexity and privacy considerations. Fisher and Kulshreshth (2024) emphasise that different DDA techniques can produce different objective and subjective effects, which supports evaluating multiple metrics rather than treating any single outcome as definitive.</w:t>
+        <w:t xml:space="preserve">Performance-based DDA extends this idea by using variables such as score, survival, deaths and accuracy. Affective systems attempt to estimate emotional state from physiological or behavioural signals, but this introduces sensor noise, additional implementation complexity and privacy considerations. Fisher and </w:t>
+      </w:r>
+      <w:proofErr w:type="spellStart"/>
+      <w:r>
+        <w:t>Kulshreshth</w:t>
+      </w:r>
+      <w:proofErr w:type="spellEnd"/>
+      <w:r>
+        <w:t xml:space="preserve"> (2024) emphasise that different DDA techniques can produce different objective and subjective effects, which supports evaluating multiple metrics rather than treating any single outcome as definitive.</w:t>
       </w:r>
     </w:p>
     <w:p>
@@ -5797,7 +5779,15 @@
         <w:jc w:val="both"/>
       </w:pPr>
       <w:r>
-        <w:t xml:space="preserve">Reinforcement learning is well suited to DDA because the controller repeatedly observes performance and changes the environment over time. Oliveira and Chaimowicz (2023) </w:t>
+        <w:t xml:space="preserve">Reinforcement learning is well suited to DDA because the controller repeatedly observes performance and changes the environment over time. Oliveira and </w:t>
+      </w:r>
+      <w:proofErr w:type="spellStart"/>
+      <w:r>
+        <w:t>Chaimowicz</w:t>
+      </w:r>
+      <w:proofErr w:type="spellEnd"/>
+      <w:r>
+        <w:t xml:space="preserve"> (2023) </w:t>
       </w:r>
       <w:r>
         <w:lastRenderedPageBreak/>
@@ -6103,7 +6093,15 @@
         <w:jc w:val="both"/>
       </w:pPr>
       <w:r>
-        <w:t>The agent did not directly control projectile speed, damage, fire interval and spread as separate actions. Instead, it changed one interpretable difficulty level from 0 to 10, and the DifficultyManager mapped that level to the underlying enemy parameters. This kept the action space compact and made the RL controller directly comparable with the rule-based controller.</w:t>
+        <w:t xml:space="preserve">The agent did not directly control projectile speed, damage, fire interval and spread as separate actions. Instead, it changed one interpretable difficulty level from 0 to 10, and the </w:t>
+      </w:r>
+      <w:proofErr w:type="spellStart"/>
+      <w:r>
+        <w:t>DifficultyManager</w:t>
+      </w:r>
+      <w:proofErr w:type="spellEnd"/>
+      <w:r>
+        <w:t xml:space="preserve"> mapped that level to the underlying enemy parameters. This kept the action space compact and made the RL controller directly comparable with the rule-based controller.</w:t>
       </w:r>
     </w:p>
     <w:p>
@@ -6161,7 +6159,15 @@
         <w:jc w:val="both"/>
       </w:pPr>
       <w:r>
-        <w:t>The final controller used a target health percentage of 60%, with a broad tolerance around that value. A death penalty of 10 was used after development testing showed that a smaller terminal penalty could be outweighed by accumulated step rewards. The controller also reduced the reward for unnecessary reversals and allowed an emergency reaction when health was falling sharply or several hits were received in quick succession. Reward tuning was treated as an implementation variable rather than evidence that RL was inherently superior; Zheng (2024) similarly identifies reward design as a central challenge in RL-based DDA.</w:t>
+        <w:t xml:space="preserve">The final controller used a target health percentage of 60%, with a broad tolerance around that value. A death penalty of 10 was used after development testing showed that a smaller terminal penalty could be outweighed by accumulated step rewards. The controller also reduced the reward for unnecessary reversals and allowed an emergency reaction when health was falling </w:t>
+      </w:r>
+      <w:proofErr w:type="gramStart"/>
+      <w:r>
+        <w:t>sharply</w:t>
+      </w:r>
+      <w:proofErr w:type="gramEnd"/>
+      <w:r>
+        <w:t xml:space="preserve"> or several hits were received in quick succession. Reward tuning was treated as an implementation variable rather than evidence that RL was inherently superior; Zheng (2024) similarly identifies reward design as a central challenge in RL-based DDA.</w:t>
       </w:r>
     </w:p>
     <w:p>
@@ -6224,7 +6230,15 @@
         <w:jc w:val="both"/>
       </w:pPr>
       <w:r>
-        <w:t>Early calibration showed that the original level-5 mapping was too punishing for the intermediate profile. The enemy mapping was therefore recalibrated rather than repeatedly changing the intermediate profile. This preserved the interpretation of the profile as the central simulated-skill reference while allowing level 5 to function as a meaningful static baseline.</w:t>
+        <w:t xml:space="preserve">Early calibration showed that the original </w:t>
+      </w:r>
+      <w:proofErr w:type="gramStart"/>
+      <w:r>
+        <w:t>level-5</w:t>
+      </w:r>
+      <w:proofErr w:type="gramEnd"/>
+      <w:r>
+        <w:t xml:space="preserve"> mapping was too punishing for the intermediate profile. The enemy mapping was therefore recalibrated rather than repeatedly changing the intermediate profile. This preserved the interpretation of the profile as the central simulated-skill reference while allowing level 5 to function as a meaningful static baseline.</w:t>
       </w:r>
     </w:p>
     <w:p>
@@ -7817,7 +7831,15 @@
         <w:fldChar w:fldCharType="end"/>
       </w:r>
       <w:r>
-        <w:t>. Final death-rate and average-survival comparison across the three difficulty systems.</w:t>
+        <w:t xml:space="preserve">. Final </w:t>
+      </w:r>
+      <w:proofErr w:type="gramStart"/>
+      <w:r>
+        <w:t>death-rate</w:t>
+      </w:r>
+      <w:proofErr w:type="gramEnd"/>
+      <w:r>
+        <w:t xml:space="preserve"> and average-survival comparison across the three difficulty systems.</w:t>
       </w:r>
       <w:bookmarkEnd w:id="41"/>
     </w:p>
@@ -8830,7 +8852,21 @@
               <w:rPr>
                 <w:b/>
               </w:rPr>
-              <w:t>Rule avg diff</w:t>
+              <w:t xml:space="preserve">Rule </w:t>
+            </w:r>
+            <w:proofErr w:type="spellStart"/>
+            <w:r>
+              <w:rPr>
+                <w:b/>
+              </w:rPr>
+              <w:t>avg</w:t>
+            </w:r>
+            <w:proofErr w:type="spellEnd"/>
+            <w:r>
+              <w:rPr>
+                <w:b/>
+              </w:rPr>
+              <w:t xml:space="preserve"> diff</w:t>
             </w:r>
           </w:p>
         </w:tc>
@@ -8849,7 +8885,21 @@
               <w:rPr>
                 <w:b/>
               </w:rPr>
-              <w:t>RL avg diff</w:t>
+              <w:t xml:space="preserve">RL </w:t>
+            </w:r>
+            <w:proofErr w:type="spellStart"/>
+            <w:r>
+              <w:rPr>
+                <w:b/>
+              </w:rPr>
+              <w:t>avg</w:t>
+            </w:r>
+            <w:proofErr w:type="spellEnd"/>
+            <w:r>
+              <w:rPr>
+                <w:b/>
+              </w:rPr>
+              <w:t xml:space="preserve"> diff</w:t>
             </w:r>
           </w:p>
         </w:tc>
@@ -10119,7 +10169,15 @@
         <w:jc w:val="both"/>
       </w:pPr>
       <w:r>
-        <w:t>Training and stochastic evaluation were closely aligned in reactivity: 12.23 changes per episode during training and 12.92 during stochastic evaluation. Average difficulty was also similar, at 3.45 in training and 3.79 in the diagnostic stochastic evaluation. This reduces concern that the deployed stochastic policy is behaving as an unrelated random controller; it samples from the learned PPO action distribution and reproduces the broad difficulty behaviour observed during training.</w:t>
+        <w:t xml:space="preserve">Training and stochastic evaluation were closely aligned in reactivity: 12.23 changes per episode during training and 12.92 during stochastic evaluation. Average difficulty was also similar, at 3.45 in training and 3.79 in the diagnostic stochastic evaluation. This reduces concern that the deployed stochastic policy is behaving as an unrelated random controller; </w:t>
+      </w:r>
+      <w:proofErr w:type="gramStart"/>
+      <w:r>
+        <w:t>it</w:t>
+      </w:r>
+      <w:proofErr w:type="gramEnd"/>
+      <w:r>
+        <w:t xml:space="preserve"> samples from the learned PPO action distribution and reproduces the broad difficulty behaviour observed during training.</w:t>
       </w:r>
     </w:p>
     <w:p>
@@ -10293,11 +10351,21 @@
         <w:jc w:val="both"/>
       </w:pPr>
       <w:r>
-        <w:t xml:space="preserve">Similar variation can be seen in other RL-DDA studies. Rahimi et al. (2023) found that their continuous RL-based DDA system outperformed rule-based methods on several player-experience and performance measures, while Oliveira and Chaimowicz (2023) showed that reinforcement learning could create a more balanced opponent and that regularisation improved generalisation to unseen opponents. In contrast, the PPO controller in this dissertation was not consistently better than the rule-based baseline, particularly for skilled and inconsistent profiles. This difference highlights the importance of testing RL-based DDA across several behaviour types rather than </w:t>
-      </w:r>
+        <w:t xml:space="preserve">Similar variation can be seen in other RL-DDA studies. Rahimi et al. (2023) found that their continuous RL-based DDA system outperformed rule-based methods on several player-experience and performance measures, while Oliveira and </w:t>
+      </w:r>
+      <w:proofErr w:type="spellStart"/>
+      <w:r>
+        <w:t>Chaimowicz</w:t>
+      </w:r>
+      <w:proofErr w:type="spellEnd"/>
+      <w:r>
+        <w:t xml:space="preserve"> (2023) showed that reinforcement learning could create a more balanced opponent and that regularisation improved generalisation to unseen opponents. In contrast, the PPO controller in this dissertation was not consistently better than the rule-based baseline, particularly for skilled and inconsistent profiles. This difference highlights the importance of testing RL-based DDA across several behaviour types rather than </w:t>
+      </w:r>
+      <w:proofErr w:type="gramStart"/>
       <w:r>
         <w:t>assuming that</w:t>
       </w:r>
+      <w:proofErr w:type="gramEnd"/>
       <w:r>
         <w:t xml:space="preserve"> an adaptive controller will perform equally well for all players.</w:t>
       </w:r>
@@ -10449,7 +10517,15 @@
         <w:jc w:val="both"/>
       </w:pPr>
       <w:r>
-        <w:t>A continuous-action policy could also be investigated, alongside entropy scheduling or alternative policy architectures, to test whether deterministic deployment can retain meaningful adaptation. The current stochastic/deterministic contrast suggests that inference design is an important research question in its own right.</w:t>
+        <w:t xml:space="preserve">A continuous-action policy could also be investigated, alongside entropy scheduling or alternative policy architectures, to test whether deterministic deployment can retain meaningful adaptation. The current stochastic/deterministic contrast suggests that inference design is an important research </w:t>
+      </w:r>
+      <w:proofErr w:type="gramStart"/>
+      <w:r>
+        <w:t>question in its own right</w:t>
+      </w:r>
+      <w:proofErr w:type="gramEnd"/>
+      <w:r>
+        <w:t>.</w:t>
       </w:r>
     </w:p>
     <w:p>
@@ -10457,7 +10533,15 @@
         <w:jc w:val="both"/>
       </w:pPr>
       <w:r>
-        <w:t>More sophisticated simulated players could incorporate explicit learning, strategic changes, fatigue or risk-taking. The same methodology could then be applied to other genres or compared directly with Unity-based RL workflows to determine how much of the observed behaviour is specific to the Godot implementation.</w:t>
+        <w:t xml:space="preserve">More </w:t>
+      </w:r>
+      <w:proofErr w:type="gramStart"/>
+      <w:r>
+        <w:t>sophisticated simulated</w:t>
+      </w:r>
+      <w:proofErr w:type="gramEnd"/>
+      <w:r>
+        <w:t xml:space="preserve"> players could incorporate explicit learning, strategic changes, fatigue or risk-taking. The same methodology could then be applied to other genres or compared directly with Unity-based RL workflows to determine how much of the observed behaviour is specific to the Godot implementation.</w:t>
       </w:r>
     </w:p>
     <w:p>
@@ -10476,7 +10560,15 @@
         <w:jc w:val="both"/>
       </w:pPr>
       <w:r>
-        <w:t>Beeching, E., Debangoye, J., Simonin, O. and Wolf, C. (2021) </w:t>
+        <w:t xml:space="preserve">Beeching, E., </w:t>
+      </w:r>
+      <w:proofErr w:type="spellStart"/>
+      <w:r>
+        <w:t>Debangoye</w:t>
+      </w:r>
+      <w:proofErr w:type="spellEnd"/>
+      <w:r>
+        <w:t>, J., Simonin, O. and Wolf, C. (2021) </w:t>
       </w:r>
       <w:r>
         <w:rPr>
@@ -10486,7 +10578,15 @@
         <w:t>Godot Reinforcement Learning Agents</w:t>
       </w:r>
       <w:r>
-        <w:t>. arXiv [preprint]. Available from: </w:t>
+        <w:t xml:space="preserve">. </w:t>
+      </w:r>
+      <w:proofErr w:type="spellStart"/>
+      <w:r>
+        <w:t>arXiv</w:t>
+      </w:r>
+      <w:proofErr w:type="spellEnd"/>
+      <w:r>
+        <w:t xml:space="preserve"> [preprint]. Available from: </w:t>
       </w:r>
       <w:hyperlink r:id="rId21" w:tgtFrame="_new" w:history="1">
         <w:r>
@@ -10539,7 +10639,15 @@
         <w:t>Entertainment Computing</w:t>
       </w:r>
       <w:r>
-        <w:t> [online]. 50: 100686. doi:10.1016/j.entcom.2024.100686. [Accessed 1 September 2026].</w:t>
+        <w:t xml:space="preserve"> [online]. 50: 100686. </w:t>
+      </w:r>
+      <w:proofErr w:type="gramStart"/>
+      <w:r>
+        <w:t>doi:10.1016/j.entcom</w:t>
+      </w:r>
+      <w:proofErr w:type="gramEnd"/>
+      <w:r>
+        <w:t>.2024.100686. [Accessed 1 September 2026].</w:t>
       </w:r>
     </w:p>
     <w:p>
@@ -10548,7 +10656,15 @@
         <w:jc w:val="both"/>
       </w:pPr>
       <w:r>
-        <w:t>Fisher, N. and Kulshreshth, A.K. (2024) Exploring dynamic difficulty adjustment methods for video games. </w:t>
+        <w:t xml:space="preserve">Fisher, N. and </w:t>
+      </w:r>
+      <w:proofErr w:type="spellStart"/>
+      <w:r>
+        <w:t>Kulshreshth</w:t>
+      </w:r>
+      <w:proofErr w:type="spellEnd"/>
+      <w:r>
+        <w:t>, A.K. (2024) Exploring dynamic difficulty adjustment methods for video games. </w:t>
       </w:r>
       <w:r>
         <w:rPr>
@@ -10567,7 +10683,15 @@
         <w:jc w:val="both"/>
       </w:pPr>
       <w:r>
-        <w:t>Jeon, H.-C., Baek, I.-C., Bae, C.-M., Park, T., You, W., Ha, T., Jung, H., Noh, J., Oh, S. and Kim, K.-J. (2024) RaidEnv: Exploring new challenges in automated content balancing for boss raid games. </w:t>
+        <w:t xml:space="preserve">Jeon, H.-C., Baek, I.-C., Bae, C.-M., Park, T., You, W., Ha, T., Jung, H., Noh, J., Oh, S. and Kim, K.-J. (2024) </w:t>
+      </w:r>
+      <w:proofErr w:type="spellStart"/>
+      <w:r>
+        <w:t>RaidEnv</w:t>
+      </w:r>
+      <w:proofErr w:type="spellEnd"/>
+      <w:r>
+        <w:t>: Exploring new challenges in automated content balancing for boss raid games. </w:t>
       </w:r>
       <w:r>
         <w:rPr>
@@ -10624,7 +10748,23 @@
         <w:jc w:val="both"/>
       </w:pPr>
       <w:r>
-        <w:t>Pfau, J., Smeddinck, J.D. and Malaka, R. (2020) Enemy within: long-term motivation effects of deep player behavior models for dynamic difficulty adjustment. In: </w:t>
+        <w:t xml:space="preserve">Pfau, J., </w:t>
+      </w:r>
+      <w:proofErr w:type="spellStart"/>
+      <w:r>
+        <w:t>Smeddinck</w:t>
+      </w:r>
+      <w:proofErr w:type="spellEnd"/>
+      <w:r>
+        <w:t xml:space="preserve">, J.D. and Malaka, R. (2020) Enemy within: long-term motivation effects of deep player </w:t>
+      </w:r>
+      <w:proofErr w:type="spellStart"/>
+      <w:r>
+        <w:t>behavior</w:t>
+      </w:r>
+      <w:proofErr w:type="spellEnd"/>
+      <w:r>
+        <w:t xml:space="preserve"> models for dynamic difficulty adjustment. In: </w:t>
       </w:r>
       <w:r>
         <w:rPr>
@@ -10643,7 +10783,23 @@
         <w:jc w:val="both"/>
       </w:pPr>
       <w:r>
-        <w:t>Rahimi, M., Moradi, H., Vahabie, A.-H. and Kebriaei, H. (2023) </w:t>
+        <w:t xml:space="preserve">Rahimi, M., Moradi, H., </w:t>
+      </w:r>
+      <w:proofErr w:type="spellStart"/>
+      <w:r>
+        <w:t>Vahabie</w:t>
+      </w:r>
+      <w:proofErr w:type="spellEnd"/>
+      <w:r>
+        <w:t xml:space="preserve">, A.-H. and </w:t>
+      </w:r>
+      <w:proofErr w:type="spellStart"/>
+      <w:r>
+        <w:t>Kebriaei</w:t>
+      </w:r>
+      <w:proofErr w:type="spellEnd"/>
+      <w:r>
+        <w:t>, H. (2023) </w:t>
       </w:r>
       <w:r>
         <w:rPr>
@@ -10653,7 +10809,15 @@
         <w:t>Continuous reinforcement learning-based dynamic difficulty adjustment in a visual working memory game</w:t>
       </w:r>
       <w:r>
-        <w:t>. arXiv [preprint]. Available from: </w:t>
+        <w:t xml:space="preserve">. </w:t>
+      </w:r>
+      <w:proofErr w:type="spellStart"/>
+      <w:r>
+        <w:t>arXiv</w:t>
+      </w:r>
+      <w:proofErr w:type="spellEnd"/>
+      <w:r>
+        <w:t xml:space="preserve"> [preprint]. Available from: </w:t>
       </w:r>
       <w:hyperlink r:id="rId22" w:tgtFrame="_new" w:history="1">
         <w:r>
@@ -10695,7 +10859,15 @@
         <w:jc w:val="both"/>
       </w:pPr>
       <w:r>
-        <w:t>Romero-Mendez, E.A., Santana-Mancilla, P.C., Garcia-Ruiz, M., Montesinos-Lopez, O.A. and Anido-Rifon, L.E. (2023) The use of deep learning to improve player engagement in a video game through a dynamic difficulty adjustment based on skills classification. </w:t>
+        <w:t>Romero-Mendez, E.A., Santana-Mancilla, P.C., Garcia-Ruiz, M., Montesinos-Lopez, O.A. and Anido-</w:t>
+      </w:r>
+      <w:proofErr w:type="spellStart"/>
+      <w:r>
+        <w:t>Rifon</w:t>
+      </w:r>
+      <w:proofErr w:type="spellEnd"/>
+      <w:r>
+        <w:t>, L.E. (2023) The use of deep learning to improve player engagement in a video game through a dynamic difficulty adjustment based on skills classification. </w:t>
       </w:r>
       <w:r>
         <w:rPr>
@@ -10715,7 +10887,15 @@
       </w:pPr>
       <w:r>
         <w:lastRenderedPageBreak/>
-        <w:t>Rupp, F., Eberhardinger, M. and Eckert, K. (2024) Simulation-driven balancing of competitive game levels with reinforcement learning. </w:t>
+        <w:t xml:space="preserve">Rupp, F., </w:t>
+      </w:r>
+      <w:proofErr w:type="spellStart"/>
+      <w:r>
+        <w:t>Eberhardinger</w:t>
+      </w:r>
+      <w:proofErr w:type="spellEnd"/>
+      <w:r>
+        <w:t>, M. and Eckert, K. (2024) Simulation-driven balancing of competitive game levels with reinforcement learning. </w:t>
       </w:r>
       <w:r>
         <w:rPr>
@@ -10744,7 +10924,15 @@
         <w:t>Entertainment Computing</w:t>
       </w:r>
       <w:r>
-        <w:t> [online]. 55: 101041. doi:10.1016/j.entcom.2025.101041. [Accessed 1 September 2026].</w:t>
+        <w:t xml:space="preserve"> [online]. 55: 101041. </w:t>
+      </w:r>
+      <w:proofErr w:type="gramStart"/>
+      <w:r>
+        <w:t>doi:10.1016/j.entcom</w:t>
+      </w:r>
+      <w:proofErr w:type="gramEnd"/>
+      <w:r>
+        <w:t>.2025.101041. [Accessed 1 September 2026].</w:t>
       </w:r>
     </w:p>
     <w:p>

</xml_diff>